<commit_message>
Update Atividades Extensionistas - Modelo de Trabalho Final.docx
</commit_message>
<xml_diff>
--- a/2026/D-atividade-extensionista-III/Atividades Extensionistas - Modelo de Trabalho Final.docx
+++ b/2026/D-atividade-extensionista-III/Atividades Extensionistas - Modelo de Trabalho Final.docx
@@ -3456,6 +3456,57 @@
           <w:szCs w:val="24"/>
         </w:rPr>
       </w:pPr>
+      <w:r>
+        <w:rPr>
+          <w:noProof/>
+          <w:sz w:val="24"/>
+          <w:szCs w:val="24"/>
+          <w:lang w:eastAsia="ja-JP"/>
+        </w:rPr>
+        <w:drawing>
+          <wp:anchor distT="0" distB="0" distL="114300" distR="114300" simplePos="0" relativeHeight="251668480" behindDoc="0" locked="0" layoutInCell="1" allowOverlap="1">
+            <wp:simplePos x="0" y="0"/>
+            <wp:positionH relativeFrom="column">
+              <wp:posOffset>418514</wp:posOffset>
+            </wp:positionH>
+            <wp:positionV relativeFrom="paragraph">
+              <wp:posOffset>-391</wp:posOffset>
+            </wp:positionV>
+            <wp:extent cx="5250473" cy="4137696"/>
+            <wp:effectExtent l="19050" t="0" r="7327" b="0"/>
+            <wp:wrapNone/>
+            <wp:docPr id="12" name="Imagem 11" descr="WhatsApp Image 2026-05-27 at 13.17.20.jpeg"/>
+            <wp:cNvGraphicFramePr>
+              <a:graphicFrameLocks xmlns:a="http://schemas.openxmlformats.org/drawingml/2006/main" noChangeAspect="1"/>
+            </wp:cNvGraphicFramePr>
+            <a:graphic xmlns:a="http://schemas.openxmlformats.org/drawingml/2006/main">
+              <a:graphicData uri="http://schemas.openxmlformats.org/drawingml/2006/picture">
+                <pic:pic xmlns:pic="http://schemas.openxmlformats.org/drawingml/2006/picture">
+                  <pic:nvPicPr>
+                    <pic:cNvPr id="0" name="WhatsApp Image 2026-05-27 at 13.17.20.jpeg"/>
+                    <pic:cNvPicPr/>
+                  </pic:nvPicPr>
+                  <pic:blipFill>
+                    <a:blip r:embed="rId16"/>
+                    <a:stretch>
+                      <a:fillRect/>
+                    </a:stretch>
+                  </pic:blipFill>
+                  <pic:spPr>
+                    <a:xfrm>
+                      <a:off x="0" y="0"/>
+                      <a:ext cx="5251726" cy="4138684"/>
+                    </a:xfrm>
+                    <a:prstGeom prst="rect">
+                      <a:avLst/>
+                    </a:prstGeom>
+                  </pic:spPr>
+                </pic:pic>
+              </a:graphicData>
+            </a:graphic>
+          </wp:anchor>
+        </w:drawing>
+      </w:r>
     </w:p>
     <w:p>
       <w:pPr>
@@ -3632,7 +3683,7 @@
                     <pic:cNvPicPr/>
                   </pic:nvPicPr>
                   <pic:blipFill>
-                    <a:blip r:embed="rId16"/>
+                    <a:blip r:embed="rId17"/>
                     <a:stretch>
                       <a:fillRect/>
                     </a:stretch>
@@ -3809,7 +3860,7 @@
                     <pic:cNvPicPr/>
                   </pic:nvPicPr>
                   <pic:blipFill>
-                    <a:blip r:embed="rId17"/>
+                    <a:blip r:embed="rId18"/>
                     <a:stretch>
                       <a:fillRect/>
                     </a:stretch>
@@ -4054,8 +4105,8 @@
       </w:pPr>
     </w:p>
     <w:sectPr>
-      <w:headerReference w:type="default" r:id="rId18"/>
-      <w:footerReference w:type="default" r:id="rId19"/>
+      <w:headerReference w:type="default" r:id="rId19"/>
+      <w:footerReference w:type="default" r:id="rId20"/>
       <w:pgSz w:w="11906" w:h="16838" w:code="9"/>
       <w:pgMar w:top="1701" w:right="1134" w:bottom="1134" w:left="1134" w:header="709" w:footer="284" w:gutter="0"/>
       <w:pgNumType w:chapStyle="1"/>
@@ -4187,7 +4238,7 @@
             <w:sz w:val="20"/>
             <w:szCs w:val="20"/>
           </w:rPr>
-          <w:t>7</w:t>
+          <w:t>8</w:t>
         </w:r>
         <w:r>
           <w:rPr>
@@ -4360,7 +4411,7 @@
                         <a:blip r:embed="rId1" cstate="print">
                           <a:extLst>
                             <a:ext uri="{28A0092B-C50C-407E-A947-70E740481C1C}">
-                              <a14:useLocalDpi xmlns:a14="http://schemas.microsoft.com/office/drawing/2010/main" xmlns:wps="http://schemas.microsoft.com/office/word/2010/wordprocessingShape" xmlns:wpi="http://schemas.microsoft.com/office/word/2010/wordprocessingInk" xmlns:wpg="http://schemas.microsoft.com/office/word/2010/wordprocessingGroup" xmlns:w16se="http://schemas.microsoft.com/office/word/2015/wordml/symex" xmlns:w16sdtdh="http://schemas.microsoft.com/office/word/2020/wordml/sdtdatahash" xmlns:w16du="http://schemas.microsoft.com/office/word/2023/wordml/word16du" xmlns:w16="http://schemas.microsoft.com/office/word/2018/wordml" xmlns:w16cid="http://schemas.microsoft.com/office/word/2016/wordml/cid" xmlns:w16cex="http://schemas.microsoft.com/office/word/2018/wordml/cex" xmlns:w15="http://schemas.microsoft.com/office/word/2012/wordml" xmlns:w14="http://schemas.microsoft.com/office/word/2010/wordml" xmlns:w="http://schemas.openxmlformats.org/wordprocessingml/2006/main" xmlns:w10="urn:schemas-microsoft-com:office:word" xmlns:wp14="http://schemas.microsoft.com/office/word/2010/wordprocessingDrawing" xmlns:v="urn:schemas-microsoft-com:vml" xmlns:oel="http://schemas.microsoft.com/office/2019/extlst" xmlns:o="urn:schemas-microsoft-com:office:office" xmlns:am3d="http://schemas.microsoft.com/office/drawing/2017/model3d" xmlns:aink="http://schemas.microsoft.com/office/drawing/2016/ink" xmlns:mc="http://schemas.openxmlformats.org/markup-compatibility/2006" xmlns:cx8="http://schemas.microsoft.com/office/drawing/2016/5/14/chartex" xmlns:cx7="http://schemas.microsoft.com/office/drawing/2016/5/13/chartex" xmlns:cx6="http://schemas.microsoft.com/office/drawing/2016/5/12/chartex" xmlns:cx5="http://schemas.microsoft.com/office/drawing/2016/5/11/chartex" xmlns:cx4="http://schemas.microsoft.com/office/drawing/2016/5/10/chartex" xmlns:cx3="http://schemas.microsoft.com/office/drawing/2016/5/9/chartex" xmlns:cx2="http://schemas.microsoft.com/office/drawing/2015/10/21/chartex" xmlns:cx1="http://schemas.microsoft.com/office/drawing/2015/9/8/chartex" xmlns:cx="http://schemas.microsoft.com/office/drawing/2014/chartex" xmlns:wpc="http://schemas.microsoft.com/office/word/2010/wordprocessingCanvas" xmlns="" val="0"/>
+                              <a14:useLocalDpi xmlns="" xmlns:wpc="http://schemas.microsoft.com/office/word/2010/wordprocessingCanvas" xmlns:cx="http://schemas.microsoft.com/office/drawing/2014/chartex" xmlns:cx1="http://schemas.microsoft.com/office/drawing/2015/9/8/chartex" xmlns:cx2="http://schemas.microsoft.com/office/drawing/2015/10/21/chartex" xmlns:cx3="http://schemas.microsoft.com/office/drawing/2016/5/9/chartex" xmlns:cx4="http://schemas.microsoft.com/office/drawing/2016/5/10/chartex" xmlns:cx5="http://schemas.microsoft.com/office/drawing/2016/5/11/chartex" xmlns:cx6="http://schemas.microsoft.com/office/drawing/2016/5/12/chartex" xmlns:cx7="http://schemas.microsoft.com/office/drawing/2016/5/13/chartex" xmlns:cx8="http://schemas.microsoft.com/office/drawing/2016/5/14/chartex" xmlns:mc="http://schemas.openxmlformats.org/markup-compatibility/2006" xmlns:aink="http://schemas.microsoft.com/office/drawing/2016/ink" xmlns:am3d="http://schemas.microsoft.com/office/drawing/2017/model3d" xmlns:o="urn:schemas-microsoft-com:office:office" xmlns:oel="http://schemas.microsoft.com/office/2019/extlst" xmlns:v="urn:schemas-microsoft-com:vml" xmlns:wp14="http://schemas.microsoft.com/office/word/2010/wordprocessingDrawing" xmlns:w10="urn:schemas-microsoft-com:office:word" xmlns:w="http://schemas.openxmlformats.org/wordprocessingml/2006/main" xmlns:w14="http://schemas.microsoft.com/office/word/2010/wordml" xmlns:w15="http://schemas.microsoft.com/office/word/2012/wordml" xmlns:w16cex="http://schemas.microsoft.com/office/word/2018/wordml/cex" xmlns:w16cid="http://schemas.microsoft.com/office/word/2016/wordml/cid" xmlns:w16="http://schemas.microsoft.com/office/word/2018/wordml" xmlns:w16du="http://schemas.microsoft.com/office/word/2023/wordml/word16du" xmlns:w16sdtdh="http://schemas.microsoft.com/office/word/2020/wordml/sdtdatahash" xmlns:w16se="http://schemas.microsoft.com/office/word/2015/wordml/symex" xmlns:wpg="http://schemas.microsoft.com/office/word/2010/wordprocessingGroup" xmlns:wpi="http://schemas.microsoft.com/office/word/2010/wordprocessingInk" xmlns:wps="http://schemas.microsoft.com/office/word/2010/wordprocessingShape" xmlns:a14="http://schemas.microsoft.com/office/drawing/2010/main" val="0"/>
                             </a:ext>
                           </a:extLst>
                         </a:blip>

</xml_diff>